<commit_message>
feat: Ajustes e alinhamentos sobre adapticode
</commit_message>
<xml_diff>
--- a/public/curriculo/Warley_Coutinho_Curriculo_ATS.docx
+++ b/public/curriculo/Warley_Coutinho_Curriculo_ATS.docx
@@ -297,7 +297,7 @@
           <w:sz w:val="22"/>
           <w:szCs w:val="22"/>
         </w:rPr>
-        <w:t xml:space="preserve"> | Next.js, React Native, Fastify, Prisma, PostgreSQL, Stripe | </w:t>
+        <w:t xml:space="preserve"> | Next.js, Fastify, Prisma, PostgreSQL, Stripe | </w:t>
       </w:r>
       <w:hyperlink r:id="rId8" w:history="1">
         <w:r>
@@ -320,7 +320,7 @@
           <w:i/>
           <w:iCs/>
         </w:rPr>
-        <w:t xml:space="preserve">SaaS multi-tenant de agendamento para salões, barbearias e clínicas de estética.</w:t>
+        <w:t xml:space="preserve">SaaS multi-tenant de agendamento para salões, barbearias e clínicas de estética (desde 2026).</w:t>
       </w:r>
     </w:p>
     <w:p>
@@ -498,7 +498,7 @@
         <w:spacing w:after="0"/>
       </w:pPr>
       <w:r>
-        <w:t xml:space="preserve">Desenvolvo software de ponta a ponta: web e mobile, APIs, banco de dados, integrações, deploy e produção.</w:t>
+        <w:t xml:space="preserve">Desde 2026, desenvolvo software de ponta a ponta: web e mobile (React Native), APIs, banco de dados, integrações e deploy.</w:t>
       </w:r>
     </w:p>
     <w:p>
@@ -511,7 +511,7 @@
         <w:spacing w:after="0"/>
       </w:pPr>
       <w:r>
-        <w:t xml:space="preserve">Criei e mantenho o Servix (web, mobile e API), em produção em 5 negócios, com ~90% menos faltas (no-shows).</w:t>
+        <w:t xml:space="preserve">Criei e mantenho o Servix (web e API), em produção em 5 negócios, com ~90% menos faltas.</w:t>
       </w:r>
     </w:p>
     <w:p>

</xml_diff>

<commit_message>
feat: alinhamento com arquitetura componetizada
</commit_message>
<xml_diff>
--- a/public/curriculo/Warley_Coutinho_Curriculo_ATS.docx
+++ b/public/curriculo/Warley_Coutinho_Curriculo_ATS.docx
@@ -36,14 +36,6 @@
             </w:pPr>
             <w:r>
               <w:t xml:space="preserve">Anápolis, GO</w:t>
-            </w:r>
-          </w:p>
-          <w:p>
-            <w:pPr>
-              <w:spacing w:before="0" w:after="0"/>
-            </w:pPr>
-            <w:r>
-              <w:t xml:space="preserve">(62) 9-9248-6492</w:t>
             </w:r>
           </w:p>
           <w:p>

</xml_diff>